<commit_message>
Record how far the snapshot has fallen behind the live database
Answers a question the project could not answer before: no, the ingredient
count was not updated. Only the annex layer was.

08_fetch_annexes.py now also asks CosIng for its authoritative totals and
writes _data/cosing_2026/currency.json. Live: 33,654 ingredients against our
13,622 -- 2.5x. The inventory has no bulk export, so ingredient stays at the
2019 snapshot and only the regulation layer is current.

The same check doubles as a completeness proof for the annex download: CosIng
reports 2,389 substances and _data/cosing_2026/ holds exactly 2,389.

The gap now appears in three places rather than being folded into prose -- the
cosing_2026 README, the insights report, and the top of the Word record's
database section -- because "13,622 ingredients" is the number every later
conclusion rests on, and it is easy to read as current when it is seven years
old.

Co-Authored-By: Claude Opus 5 <noreply@anthropic.com>
</commit_message>
<xml_diff>
--- a/90-Reports/實作階段狀態紀錄.docx
+++ b/90-Reports/實作階段狀態紀錄.docx
@@ -271,7 +271,7 @@
                 <w:sz w:val="19"/>
                 <w:szCs w:val="19"/>
               </w:rPr>
-              <w:t xml:space="preserve">EU COSING 化妝品成分資料庫，13,622 筆</w:t>
+              <w:t xml:space="preserve">EU COSING 化妝品成分資料庫，13,622 筆（2019-11-21 快照）</w:t>
             </w:r>
           </w:p>
         </w:tc>
@@ -381,7 +381,7 @@
                 <w:sz w:val="19"/>
                 <w:szCs w:val="19"/>
               </w:rPr>
-              <w:t xml:space="preserve">git，9 個 commit</w:t>
+              <w:t xml:space="preserve">git，10 個 commit</w:t>
             </w:r>
           </w:p>
         </w:tc>
@@ -1544,6 +1544,398 @@
           <w:szCs w:val="30"/>
         </w:rPr>
         <w:t xml:space="preserve">二、目前資料庫狀態</w:t>
+      </w:r>
+    </w:p>
+    <w:p>
+      <w:pPr>
+        <w:spacing w:after="120" w:before="0"/>
+      </w:pPr>
+      <w:r>
+        <w:rPr>
+          <w:rFonts w:ascii="Microsoft JhengHei" w:cs="Microsoft JhengHei" w:eastAsia="Microsoft JhengHei" w:hAnsi="Microsoft JhengHei"/>
+          <w:b/>
+          <w:bCs/>
+          <w:sz w:val="20"/>
+          <w:szCs w:val="20"/>
+        </w:rPr>
+        <w:t xml:space="preserve">⚠️ 成分數量並未更新</w:t>
+      </w:r>
+    </w:p>
+    <w:tbl>
+      <w:tblPr>
+        <w:tblW w:type="dxa" w:w="9026"/>
+        <w:tblBorders>
+          <w:top w:val="single" w:color="auto" w:sz="4"/>
+          <w:left w:val="single" w:color="auto" w:sz="4"/>
+          <w:bottom w:val="single" w:color="auto" w:sz="4"/>
+          <w:right w:val="single" w:color="auto" w:sz="4"/>
+          <w:insideH w:val="single" w:color="auto" w:sz="4"/>
+          <w:insideV w:val="single" w:color="auto" w:sz="4"/>
+        </w:tblBorders>
+      </w:tblPr>
+      <w:tblGrid>
+        <w:gridCol w:w="2600"/>
+        <w:gridCol w:w="2200"/>
+        <w:gridCol w:w="2200"/>
+        <w:gridCol w:w="2026"/>
+      </w:tblGrid>
+      <w:tr>
+        <w:trPr>
+          <w:tblHeader/>
+        </w:trPr>
+        <w:tc>
+          <w:tcPr>
+            <w:tcW w:type="dxa" w:w="2600"/>
+            <w:shd w:fill="1F3864" w:color="auto" w:val="clear"/>
+            <w:tcMar>
+              <w:top w:type="dxa" w:w="60"/>
+              <w:left w:type="dxa" w:w="100"/>
+              <w:bottom w:type="dxa" w:w="60"/>
+              <w:right w:type="dxa" w:w="100"/>
+            </w:tcMar>
+          </w:tcPr>
+          <w:p>
+            <w:pPr>
+              <w:spacing w:after="0"/>
+            </w:pPr>
+            <w:r>
+              <w:rPr>
+                <w:rFonts w:ascii="Microsoft JhengHei" w:cs="Microsoft JhengHei" w:eastAsia="Microsoft JhengHei" w:hAnsi="Microsoft JhengHei"/>
+                <w:b/>
+                <w:bCs/>
+                <w:color w:val="FFFFFF"/>
+                <w:sz w:val="19"/>
+                <w:szCs w:val="19"/>
+              </w:rPr>
+              <w:t xml:space="preserve"/>
+            </w:r>
+          </w:p>
+        </w:tc>
+        <w:tc>
+          <w:tcPr>
+            <w:tcW w:type="dxa" w:w="2200"/>
+            <w:shd w:fill="1F3864" w:color="auto" w:val="clear"/>
+            <w:tcMar>
+              <w:top w:type="dxa" w:w="60"/>
+              <w:left w:type="dxa" w:w="100"/>
+              <w:bottom w:type="dxa" w:w="60"/>
+              <w:right w:type="dxa" w:w="100"/>
+            </w:tcMar>
+          </w:tcPr>
+          <w:p>
+            <w:pPr>
+              <w:spacing w:after="0"/>
+              <w:jc w:val="right"/>
+            </w:pPr>
+            <w:r>
+              <w:rPr>
+                <w:rFonts w:ascii="Microsoft JhengHei" w:cs="Microsoft JhengHei" w:eastAsia="Microsoft JhengHei" w:hAnsi="Microsoft JhengHei"/>
+                <w:b/>
+                <w:bCs/>
+                <w:color w:val="FFFFFF"/>
+                <w:sz w:val="19"/>
+                <w:szCs w:val="19"/>
+              </w:rPr>
+              <w:t xml:space="preserve">本專案</w:t>
+            </w:r>
+          </w:p>
+        </w:tc>
+        <w:tc>
+          <w:tcPr>
+            <w:tcW w:type="dxa" w:w="2200"/>
+            <w:shd w:fill="1F3864" w:color="auto" w:val="clear"/>
+            <w:tcMar>
+              <w:top w:type="dxa" w:w="60"/>
+              <w:left w:type="dxa" w:w="100"/>
+              <w:bottom w:type="dxa" w:w="60"/>
+              <w:right w:type="dxa" w:w="100"/>
+            </w:tcMar>
+          </w:tcPr>
+          <w:p>
+            <w:pPr>
+              <w:spacing w:after="0"/>
+              <w:jc w:val="right"/>
+            </w:pPr>
+            <w:r>
+              <w:rPr>
+                <w:rFonts w:ascii="Microsoft JhengHei" w:cs="Microsoft JhengHei" w:eastAsia="Microsoft JhengHei" w:hAnsi="Microsoft JhengHei"/>
+                <w:b/>
+                <w:bCs/>
+                <w:color w:val="FFFFFF"/>
+                <w:sz w:val="19"/>
+                <w:szCs w:val="19"/>
+              </w:rPr>
+              <w:t xml:space="preserve">CosIng 線上</w:t>
+            </w:r>
+          </w:p>
+        </w:tc>
+        <w:tc>
+          <w:tcPr>
+            <w:tcW w:type="dxa" w:w="2026"/>
+            <w:shd w:fill="1F3864" w:color="auto" w:val="clear"/>
+            <w:tcMar>
+              <w:top w:type="dxa" w:w="60"/>
+              <w:left w:type="dxa" w:w="100"/>
+              <w:bottom w:type="dxa" w:w="60"/>
+              <w:right w:type="dxa" w:w="100"/>
+            </w:tcMar>
+          </w:tcPr>
+          <w:p>
+            <w:pPr>
+              <w:spacing w:after="0"/>
+            </w:pPr>
+            <w:r>
+              <w:rPr>
+                <w:rFonts w:ascii="Microsoft JhengHei" w:cs="Microsoft JhengHei" w:eastAsia="Microsoft JhengHei" w:hAnsi="Microsoft JhengHei"/>
+                <w:b/>
+                <w:bCs/>
+                <w:color w:val="FFFFFF"/>
+                <w:sz w:val="19"/>
+                <w:szCs w:val="19"/>
+              </w:rPr>
+              <w:t xml:space="preserve"/>
+            </w:r>
+          </w:p>
+        </w:tc>
+      </w:tr>
+      <w:tr>
+        <w:tc>
+          <w:tcPr>
+            <w:tcW w:type="dxa" w:w="2600"/>
+            <w:tcMar>
+              <w:top w:type="dxa" w:w="60"/>
+              <w:left w:type="dxa" w:w="100"/>
+              <w:bottom w:type="dxa" w:w="60"/>
+              <w:right w:type="dxa" w:w="100"/>
+            </w:tcMar>
+          </w:tcPr>
+          <w:p>
+            <w:pPr>
+              <w:spacing w:after="0"/>
+            </w:pPr>
+            <w:r>
+              <w:rPr>
+                <w:rFonts w:ascii="Microsoft JhengHei" w:cs="Microsoft JhengHei" w:eastAsia="Microsoft JhengHei" w:hAnsi="Microsoft JhengHei"/>
+                <w:b w:val="false"/>
+                <w:bCs w:val="false"/>
+                <w:sz w:val="19"/>
+                <w:szCs w:val="19"/>
+              </w:rPr>
+              <w:t xml:space="preserve">成分（ingredient）</w:t>
+            </w:r>
+          </w:p>
+        </w:tc>
+        <w:tc>
+          <w:tcPr>
+            <w:tcW w:type="dxa" w:w="2200"/>
+            <w:tcMar>
+              <w:top w:type="dxa" w:w="60"/>
+              <w:left w:type="dxa" w:w="100"/>
+              <w:bottom w:type="dxa" w:w="60"/>
+              <w:right w:type="dxa" w:w="100"/>
+            </w:tcMar>
+          </w:tcPr>
+          <w:p>
+            <w:pPr>
+              <w:spacing w:after="0"/>
+              <w:jc w:val="right"/>
+            </w:pPr>
+            <w:r>
+              <w:rPr>
+                <w:rFonts w:ascii="Microsoft JhengHei" w:cs="Microsoft JhengHei" w:eastAsia="Microsoft JhengHei" w:hAnsi="Microsoft JhengHei"/>
+                <w:b w:val="false"/>
+                <w:bCs w:val="false"/>
+                <w:sz w:val="19"/>
+                <w:szCs w:val="19"/>
+              </w:rPr>
+              <w:t xml:space="preserve">13,622</w:t>
+            </w:r>
+          </w:p>
+        </w:tc>
+        <w:tc>
+          <w:tcPr>
+            <w:tcW w:type="dxa" w:w="2200"/>
+            <w:tcMar>
+              <w:top w:type="dxa" w:w="60"/>
+              <w:left w:type="dxa" w:w="100"/>
+              <w:bottom w:type="dxa" w:w="60"/>
+              <w:right w:type="dxa" w:w="100"/>
+            </w:tcMar>
+          </w:tcPr>
+          <w:p>
+            <w:pPr>
+              <w:spacing w:after="0"/>
+              <w:jc w:val="right"/>
+            </w:pPr>
+            <w:r>
+              <w:rPr>
+                <w:rFonts w:ascii="Microsoft JhengHei" w:cs="Microsoft JhengHei" w:eastAsia="Microsoft JhengHei" w:hAnsi="Microsoft JhengHei"/>
+                <w:b w:val="false"/>
+                <w:bCs w:val="false"/>
+                <w:sz w:val="19"/>
+                <w:szCs w:val="19"/>
+              </w:rPr>
+              <w:t xml:space="preserve">33,654</w:t>
+            </w:r>
+          </w:p>
+        </w:tc>
+        <w:tc>
+          <w:tcPr>
+            <w:tcW w:type="dxa" w:w="2026"/>
+            <w:tcMar>
+              <w:top w:type="dxa" w:w="60"/>
+              <w:left w:type="dxa" w:w="100"/>
+              <w:bottom w:type="dxa" w:w="60"/>
+              <w:right w:type="dxa" w:w="100"/>
+            </w:tcMar>
+          </w:tcPr>
+          <w:p>
+            <w:pPr>
+              <w:spacing w:after="0"/>
+            </w:pPr>
+            <w:r>
+              <w:rPr>
+                <w:rFonts w:ascii="Microsoft JhengHei" w:cs="Microsoft JhengHei" w:eastAsia="Microsoft JhengHei" w:hAnsi="Microsoft JhengHei"/>
+                <w:b w:val="false"/>
+                <w:bCs w:val="false"/>
+                <w:sz w:val="19"/>
+                <w:szCs w:val="19"/>
+              </w:rPr>
+              <w:t xml:space="preserve">2.5 倍，未更新</w:t>
+            </w:r>
+          </w:p>
+        </w:tc>
+      </w:tr>
+      <w:tr>
+        <w:tc>
+          <w:tcPr>
+            <w:tcW w:type="dxa" w:w="2600"/>
+            <w:shd w:fill="E8EEF7" w:color="auto" w:val="clear"/>
+            <w:tcMar>
+              <w:top w:type="dxa" w:w="60"/>
+              <w:left w:type="dxa" w:w="100"/>
+              <w:bottom w:type="dxa" w:w="60"/>
+              <w:right w:type="dxa" w:w="100"/>
+            </w:tcMar>
+          </w:tcPr>
+          <w:p>
+            <w:pPr>
+              <w:spacing w:after="0"/>
+            </w:pPr>
+            <w:r>
+              <w:rPr>
+                <w:rFonts w:ascii="Microsoft JhengHei" w:cs="Microsoft JhengHei" w:eastAsia="Microsoft JhengHei" w:hAnsi="Microsoft JhengHei"/>
+                <w:b w:val="false"/>
+                <w:bCs w:val="false"/>
+                <w:sz w:val="19"/>
+                <w:szCs w:val="19"/>
+              </w:rPr>
+              <w:t xml:space="preserve">法規物質（substance）</w:t>
+            </w:r>
+          </w:p>
+        </w:tc>
+        <w:tc>
+          <w:tcPr>
+            <w:tcW w:type="dxa" w:w="2200"/>
+            <w:shd w:fill="E8EEF7" w:color="auto" w:val="clear"/>
+            <w:tcMar>
+              <w:top w:type="dxa" w:w="60"/>
+              <w:left w:type="dxa" w:w="100"/>
+              <w:bottom w:type="dxa" w:w="60"/>
+              <w:right w:type="dxa" w:w="100"/>
+            </w:tcMar>
+          </w:tcPr>
+          <w:p>
+            <w:pPr>
+              <w:spacing w:after="0"/>
+              <w:jc w:val="right"/>
+            </w:pPr>
+            <w:r>
+              <w:rPr>
+                <w:rFonts w:ascii="Microsoft JhengHei" w:cs="Microsoft JhengHei" w:eastAsia="Microsoft JhengHei" w:hAnsi="Microsoft JhengHei"/>
+                <w:b w:val="false"/>
+                <w:bCs w:val="false"/>
+                <w:sz w:val="19"/>
+                <w:szCs w:val="19"/>
+              </w:rPr>
+              <w:t xml:space="preserve">2,389</w:t>
+            </w:r>
+          </w:p>
+        </w:tc>
+        <w:tc>
+          <w:tcPr>
+            <w:tcW w:type="dxa" w:w="2200"/>
+            <w:shd w:fill="E8EEF7" w:color="auto" w:val="clear"/>
+            <w:tcMar>
+              <w:top w:type="dxa" w:w="60"/>
+              <w:left w:type="dxa" w:w="100"/>
+              <w:bottom w:type="dxa" w:w="60"/>
+              <w:right w:type="dxa" w:w="100"/>
+            </w:tcMar>
+          </w:tcPr>
+          <w:p>
+            <w:pPr>
+              <w:spacing w:after="0"/>
+              <w:jc w:val="right"/>
+            </w:pPr>
+            <w:r>
+              <w:rPr>
+                <w:rFonts w:ascii="Microsoft JhengHei" w:cs="Microsoft JhengHei" w:eastAsia="Microsoft JhengHei" w:hAnsi="Microsoft JhengHei"/>
+                <w:b w:val="false"/>
+                <w:bCs w:val="false"/>
+                <w:sz w:val="19"/>
+                <w:szCs w:val="19"/>
+              </w:rPr>
+              <w:t xml:space="preserve">2,389</w:t>
+            </w:r>
+          </w:p>
+        </w:tc>
+        <w:tc>
+          <w:tcPr>
+            <w:tcW w:type="dxa" w:w="2026"/>
+            <w:shd w:fill="E8EEF7" w:color="auto" w:val="clear"/>
+            <w:tcMar>
+              <w:top w:type="dxa" w:w="60"/>
+              <w:left w:type="dxa" w:w="100"/>
+              <w:bottom w:type="dxa" w:w="60"/>
+              <w:right w:type="dxa" w:w="100"/>
+            </w:tcMar>
+          </w:tcPr>
+          <w:p>
+            <w:pPr>
+              <w:spacing w:after="0"/>
+            </w:pPr>
+            <w:r>
+              <w:rPr>
+                <w:rFonts w:ascii="Microsoft JhengHei" w:cs="Microsoft JhengHei" w:eastAsia="Microsoft JhengHei" w:hAnsi="Microsoft JhengHei"/>
+                <w:b w:val="false"/>
+                <w:bCs w:val="false"/>
+                <w:sz w:val="19"/>
+                <w:szCs w:val="19"/>
+              </w:rPr>
+              <w:t xml:space="preserve">已全數取回</w:t>
+            </w:r>
+          </w:p>
+        </w:tc>
+      </w:tr>
+    </w:tbl>
+    <w:p>
+      <w:pPr>
+        <w:pBdr>
+          <w:left w:val="single" w:color="C9A227" w:sz="18" w:space="12"/>
+        </w:pBdr>
+        <w:spacing w:after="160" w:before="80"/>
+        <w:ind w:left="240"/>
+      </w:pPr>
+      <w:r>
+        <w:rPr>
+          <w:rFonts w:ascii="Microsoft JhengHei" w:cs="Microsoft JhengHei" w:eastAsia="Microsoft JhengHei" w:hAnsi="Microsoft JhengHei"/>
+          <w:i w:val="false"/>
+          <w:iCs w:val="false"/>
+          <w:sz w:val="20"/>
+          <w:szCs w:val="20"/>
+        </w:rPr>
+        <w:t xml:space="preserve">2026-08-20 直接向 CosIng 查得的權威總數。完整 Inventory 沒有批次匯出途徑（搜尋強制關鍵字、結果頁無匯出鈕、data.europa.eu 舊資料集已失效），因此 ingredient 表維持 2019 快照。本次只更新了法規層。線上 substance 總數與取回的條目數相符，可確認法規層抓取完整。</w:t>
       </w:r>
     </w:p>
     <w:p>
@@ -2474,7 +2866,7 @@
           <w:sz w:val="17"/>
           <w:szCs w:val="17"/>
         </w:rPr>
-        <w:t xml:space="preserve">  ├─ Annex 條文             2,389</w:t>
+        <w:t xml:space="preserve">  ├─ Annex 條文             2,389    與線上總數相符，抓取完整</w:t>
       </w:r>
     </w:p>
     <w:p>
@@ -11241,6 +11633,62 @@
                 <w:szCs w:val="19"/>
               </w:rPr>
               <w:t xml:space="preserve">五項全數通過</w:t>
+            </w:r>
+          </w:p>
+        </w:tc>
+      </w:tr>
+      <w:tr>
+        <w:tc>
+          <w:tcPr>
+            <w:tcW w:type="dxa" w:w="1700"/>
+            <w:shd w:fill="E8EEF7" w:color="auto" w:val="clear"/>
+            <w:tcMar>
+              <w:top w:type="dxa" w:w="60"/>
+              <w:left w:type="dxa" w:w="100"/>
+              <w:bottom w:type="dxa" w:w="60"/>
+              <w:right w:type="dxa" w:w="100"/>
+            </w:tcMar>
+          </w:tcPr>
+          <w:p>
+            <w:pPr>
+              <w:spacing w:after="0"/>
+            </w:pPr>
+            <w:r>
+              <w:rPr>
+                <w:rFonts w:ascii="Microsoft JhengHei" w:cs="Microsoft JhengHei" w:eastAsia="Microsoft JhengHei" w:hAnsi="Microsoft JhengHei"/>
+                <w:b/>
+                <w:bCs/>
+                <w:sz w:val="19"/>
+                <w:szCs w:val="19"/>
+              </w:rPr>
+              <w:t xml:space="preserve">未更新者</w:t>
+            </w:r>
+          </w:p>
+        </w:tc>
+        <w:tc>
+          <w:tcPr>
+            <w:tcW w:type="dxa" w:w="7326"/>
+            <w:shd w:fill="E8EEF7" w:color="auto" w:val="clear"/>
+            <w:tcMar>
+              <w:top w:type="dxa" w:w="60"/>
+              <w:left w:type="dxa" w:w="100"/>
+              <w:bottom w:type="dxa" w:w="60"/>
+              <w:right w:type="dxa" w:w="100"/>
+            </w:tcMar>
+          </w:tcPr>
+          <w:p>
+            <w:pPr>
+              <w:spacing w:after="0"/>
+            </w:pPr>
+            <w:r>
+              <w:rPr>
+                <w:rFonts w:ascii="Microsoft JhengHei" w:cs="Microsoft JhengHei" w:eastAsia="Microsoft JhengHei" w:hAnsi="Microsoft JhengHei"/>
+                <w:b w:val="false"/>
+                <w:bCs w:val="false"/>
+                <w:sz w:val="19"/>
+                <w:szCs w:val="19"/>
+              </w:rPr>
+              <w:t xml:space="preserve">成分主表仍為 2019 快照（13,622），線上已達 33,654，因無批次匯出途徑而未動</w:t>
             </w:r>
           </w:p>
         </w:tc>

</xml_diff>

<commit_message>
Update the Word record and make its numbers checkable
Adds verify_docx_numbers.py, which queries all 39 statistics the generator
states and exits non-zero on any mismatch. The record's figures are transcribed
by hand rather than queried live, and three had been wrong at some point, so
the audit is now a step rather than a hope.

It immediately earned itself: the Phase 4 section said "10,008 unique CAS can
be exchanged for structures". 10,008 was the count of distinct raw CAS No field
values from Phase 0 profiling; the number that matters for a PubChem lookup is
distinct CAS numbers, which is 9,796 primary or 10,531 including multi-valued
cells. Three different quantities, and the sentence quoted the one that did not
answer its own question.

Generation date and commit count are now read from the clock and from git, so
the two figures most likely to go stale no longer can.

Co-Authored-By: Claude Opus 5 <noreply@anthropic.com>
</commit_message>
<xml_diff>
--- a/90-Reports/實作階段狀態紀錄.docx
+++ b/90-Reports/實作階段狀態紀錄.docx
@@ -161,7 +161,7 @@
                 <w:sz w:val="19"/>
                 <w:szCs w:val="19"/>
               </w:rPr>
-              <w:t xml:space="preserve">2026-08-20</w:t>
+              <w:t xml:space="preserve">2026-08-21</w:t>
             </w:r>
           </w:p>
         </w:tc>
@@ -381,7 +381,7 @@
                 <w:sz w:val="19"/>
                 <w:szCs w:val="19"/>
               </w:rPr>
-              <w:t xml:space="preserve">git，15 個 commit</w:t>
+              <w:t xml:space="preserve">git，16 個 commit</w:t>
             </w:r>
           </w:p>
         </w:tc>
@@ -11029,7 +11029,7 @@
                 <w:sz w:val="19"/>
                 <w:szCs w:val="19"/>
               </w:rPr>
-              <w:t xml:space="preserve">原計劃未想到的第二條路徑；10,008 個唯一 CAS 可直接換結構，對 9,760 筆合成化學品尤其有效</w:t>
+              <w:t xml:space="preserve">原計劃未想到的第二條路徑；2019 快照有 9,796 個不重複 CAS 主碼（含多值為 10,531），對 9,760 筆合成化學品尤其有效</w:t>
             </w:r>
           </w:p>
         </w:tc>

</xml_diff>

<commit_message>
Phase 6b: CosIng cosmetic ingredient explorer with knowledge graph
Static single-page app for GitHub Pages featuring:
- Force-directed graph with 5 node types (Family, Function, Ingredient, Species, Compound)
- Ego-graph navigation with breadcrumb trail and expand buttons
- Full-text search across 33,638 ingredients
- SVG molecular structures (631 chunks, lazy-loaded via DecompressionStream)
- Three-state dark mode, responsive layout
- Data sources: EU CosIng, GBIF, LOTUS, PubChem
- MIT License

Also includes vault notes (1,700+ species, 200+ families, MOCs) and
association analysis scripts.

Co-Authored-By: Claude Opus 4.6 <noreply@anthropic.com>
</commit_message>
<xml_diff>
--- a/90-Reports/實作階段狀態紀錄.docx
+++ b/90-Reports/實作階段狀態紀錄.docx
@@ -161,7 +161,7 @@
                 <w:sz w:val="19"/>
                 <w:szCs w:val="19"/>
               </w:rPr>
-              <w:t xml:space="preserve">2026-08-21</w:t>
+              <w:t xml:space="preserve">2026-08-27</w:t>
             </w:r>
           </w:p>
         </w:tc>
@@ -381,7 +381,7 @@
                 <w:sz w:val="19"/>
                 <w:szCs w:val="19"/>
               </w:rPr>
-              <w:t xml:space="preserve">git，16 個 commit</w:t>
+              <w:t xml:space="preserve">git，18 個 commit</w:t>
             </w:r>
           </w:p>
         </w:tc>
@@ -1226,7 +1226,7 @@
         <w:tc>
           <w:tcPr>
             <w:tcW w:type="dxa" w:w="1300"/>
-            <w:shd w:fill="EFEFEF" w:color="auto" w:val="clear"/>
+            <w:shd w:fill="D9EAD3" w:color="auto" w:val="clear"/>
             <w:tcMar>
               <w:top w:type="dxa" w:w="60"/>
               <w:left w:type="dxa" w:w="100"/>
@@ -1242,10 +1242,12 @@
             <w:r>
               <w:rPr>
                 <w:rFonts w:ascii="Microsoft JhengHei" w:cs="Microsoft JhengHei" w:eastAsia="Microsoft JhengHei" w:hAnsi="Microsoft JhengHei"/>
-                <w:sz w:val="19"/>
-                <w:szCs w:val="19"/>
-              </w:rPr>
-              <w:t xml:space="preserve">⬜ 未開始</w:t>
+                <w:b/>
+                <w:bCs/>
+                <w:sz w:val="19"/>
+                <w:szCs w:val="19"/>
+              </w:rPr>
+              <w:t xml:space="preserve">✅ 完成</w:t>
             </w:r>
           </w:p>
         </w:tc>
@@ -1272,7 +1274,7 @@
                 <w:sz w:val="19"/>
                 <w:szCs w:val="19"/>
               </w:rPr>
-              <w:t xml:space="preserve">90-Reports/ 下各項分析</w:t>
+              <w:t xml:space="preserve">90-Reports/associations_v2026.md — 六項分析</w:t>
             </w:r>
           </w:p>
         </w:tc>
@@ -1334,7 +1336,7 @@
         <w:tc>
           <w:tcPr>
             <w:tcW w:type="dxa" w:w="1300"/>
-            <w:shd w:fill="EFEFEF" w:color="auto" w:val="clear"/>
+            <w:shd w:fill="D9EAD3" w:color="auto" w:val="clear"/>
             <w:tcMar>
               <w:top w:type="dxa" w:w="60"/>
               <w:left w:type="dxa" w:w="100"/>
@@ -1350,10 +1352,12 @@
             <w:r>
               <w:rPr>
                 <w:rFonts w:ascii="Microsoft JhengHei" w:cs="Microsoft JhengHei" w:eastAsia="Microsoft JhengHei" w:hAnsi="Microsoft JhengHei"/>
-                <w:sz w:val="19"/>
-                <w:szCs w:val="19"/>
-              </w:rPr>
-              <w:t xml:space="preserve">⬜ 未開始</w:t>
+                <w:b/>
+                <w:bCs/>
+                <w:sz w:val="19"/>
+                <w:szCs w:val="19"/>
+              </w:rPr>
+              <w:t xml:space="preserve">✅ 完成</w:t>
             </w:r>
           </w:p>
         </w:tc>
@@ -1379,7 +1383,7 @@
                 <w:sz w:val="19"/>
                 <w:szCs w:val="19"/>
               </w:rPr>
-              <w:t xml:space="preserve">10-Species / 20-Family / 30-MOC 筆記</w:t>
+              <w:t xml:space="preserve">2,827 物種 + 376 科 + 134 MOC = 3,340 筆記</w:t>
             </w:r>
           </w:p>
         </w:tc>
@@ -1528,7 +1532,7 @@
           <w:sz w:val="20"/>
           <w:szCs w:val="20"/>
         </w:rPr>
-        <w:t xml:space="preserve">8 個 Phase 中，5 個完成、3 個未開始。Phase 0–3 在兩份資料上各跑完一次，Phase 4 已在 2026 資料上完成。</w:t>
+        <w:t xml:space="preserve">8 個 Phase 中，7 個完成、1 個未開始。Phase 0–3 在兩份資料上各跑完一次，Phase 4–6 已在 2026 資料上完成。</w:t>
       </w:r>
     </w:p>
     <w:p>
@@ -10844,7 +10848,7 @@
           <w:sz w:val="24"/>
           <w:szCs w:val="24"/>
         </w:rPr>
-        <w:t xml:space="preserve">Phase 4 — 外部化學層富集　⬜ 未開始</w:t>
+        <w:t xml:space="preserve">Phase 4 — 外部化學層富集　✅ 完成</w:t>
       </w:r>
     </w:p>
     <w:tbl>
@@ -11068,7 +11072,7 @@
           <w:sz w:val="24"/>
           <w:szCs w:val="24"/>
         </w:rPr>
-        <w:t xml:space="preserve">Phase 5 — 挖掘隱藏關聯　⬜ 未開始</w:t>
+        <w:t xml:space="preserve">Phase 5 — 挖掘隱藏關聯　✅ 完成</w:t>
       </w:r>
     </w:p>
     <w:p>
@@ -11081,7 +11085,7 @@
           <w:sz w:val="20"/>
           <w:szCs w:val="20"/>
         </w:rPr>
-        <w:t xml:space="preserve">前三項離線即可執行，不需等 Phase 4。</w:t>
+        <w:t xml:space="preserve">六項跨面向分析全部完成，產出 associations_v2026.md（780 行），七項驗收全數通過。</w:t>
       </w:r>
     </w:p>
     <w:tbl>
@@ -11186,7 +11190,7 @@
                 <w:sz w:val="19"/>
                 <w:szCs w:val="19"/>
               </w:rPr>
-              <w:t xml:space="preserve">說明</w:t>
+              <w:t xml:space="preserve">結果</w:t>
             </w:r>
           </w:p>
         </w:tc>
@@ -11267,7 +11271,7 @@
                 <w:sz w:val="19"/>
                 <w:szCs w:val="19"/>
               </w:rPr>
-              <w:t xml:space="preserve">某用途集中在哪些科，列出該科中尚未收錄的物種</w:t>
+              <w:t xml:space="preserve">299 個科有 gap 候選；Asteraceae 1,807 種、Fabaceae 1,751 種在 LOTUS 中有化合物但不在 COSING</w:t>
             </w:r>
           </w:p>
         </w:tc>
@@ -11351,7 +11355,7 @@
                 <w:sz w:val="19"/>
                 <w:szCs w:val="19"/>
               </w:rPr>
-              <w:t xml:space="preserve">交叉 Restriction 與科屬階層；原計劃完全沒有，對化妝品應用最直接</w:t>
+              <w:t xml:space="preserve">Pinaceae 31.3%、Rutaceae 25.1% 受限率最高；II/358 呋喃香豆素驅動 Rutaceae</w:t>
             </w:r>
           </w:p>
         </w:tc>
@@ -11406,7 +11410,7 @@
                 <w:sz w:val="19"/>
                 <w:szCs w:val="19"/>
               </w:rPr>
-              <w:t xml:space="preserve">用途相同但親緣極遠</w:t>
+              <w:t xml:space="preserve">趨同用途檢測</w:t>
             </w:r>
           </w:p>
         </w:tc>
@@ -11432,7 +11436,7 @@
                 <w:sz w:val="19"/>
                 <w:szCs w:val="19"/>
               </w:rPr>
-              <w:t xml:space="preserve">趨同演化，或 Function 標錯，兩者都值得查核</w:t>
+              <w:t xml:space="preserve">跨科 Function 聚類：Skin Conditioning 橫跨 308 科，Antioxidant 橫跨 171 科</w:t>
             </w:r>
           </w:p>
         </w:tc>
@@ -11489,7 +11493,7 @@
                 <w:sz w:val="19"/>
                 <w:szCs w:val="19"/>
               </w:rPr>
-              <w:t xml:space="preserve">同科不同屬但用途一致</w:t>
+              <w:t xml:space="preserve">化學分類學一致性</w:t>
             </w:r>
           </w:p>
         </w:tc>
@@ -11516,7 +11520,7 @@
                 <w:sz w:val="19"/>
                 <w:szCs w:val="19"/>
               </w:rPr>
-              <w:t xml:space="preserve">化學分類學支持，可信度最高</w:t>
+              <w:t xml:space="preserve">Cucurbitaceae、Solanaceae、Theaceae 100% 家族一致性；前五鄰居全為同科</w:t>
             </w:r>
           </w:p>
         </w:tc>
@@ -11571,7 +11575,7 @@
                 <w:sz w:val="19"/>
                 <w:szCs w:val="19"/>
               </w:rPr>
-              <w:t xml:space="preserve">同物種橫向比較群組</w:t>
+              <w:t xml:space="preserve">同物種部位比較</w:t>
             </w:r>
           </w:p>
         </w:tc>
@@ -11597,7 +11601,7 @@
                 <w:sz w:val="19"/>
                 <w:szCs w:val="19"/>
               </w:rPr>
-              <w:t xml:space="preserve">Phase 3 產出直接支援</w:t>
+              <w:t xml:space="preserve">同物種不同部位/製程的組合自動成組</w:t>
             </w:r>
           </w:p>
         </w:tc>
@@ -11654,7 +11658,7 @@
                 <w:sz w:val="19"/>
                 <w:szCs w:val="19"/>
               </w:rPr>
-              <w:t xml:space="preserve">成分集合相似度</w:t>
+              <w:t xml:space="preserve">成分集合 Jaccard 相似度</w:t>
             </w:r>
           </w:p>
         </w:tc>
@@ -11681,7 +11685,7 @@
                 <w:sz w:val="19"/>
                 <w:szCs w:val="19"/>
               </w:rPr>
-              <w:t xml:space="preserve">需 Phase 4；只留 top-k 鄰居，不建全連接圖</w:t>
+              <w:t xml:space="preserve">2,017 對（J≥0.15 且 ≥5 共享），1,498 為跨科對；Eucalyptus dives × Lagarostrobos franklinii J=0.789</w:t>
             </w:r>
           </w:p>
         </w:tc>
@@ -11701,7 +11705,20 @@
           <w:sz w:val="24"/>
           <w:szCs w:val="24"/>
         </w:rPr>
-        <w:t xml:space="preserve">Phase 6 — Vault 生成　⬜ 未開始</w:t>
+        <w:t xml:space="preserve">Phase 6 — Vault 生成　✅ 完成</w:t>
+      </w:r>
+    </w:p>
+    <w:p>
+      <w:pPr>
+        <w:spacing w:after="120" w:before="0"/>
+      </w:pPr>
+      <w:r>
+        <w:rPr>
+          <w:rFonts w:ascii="Microsoft JhengHei" w:cs="Microsoft JhengHei" w:eastAsia="Microsoft JhengHei" w:hAnsi="Microsoft JhengHei"/>
+          <w:sz w:val="20"/>
+          <w:szCs w:val="20"/>
+        </w:rPr>
+        <w:t xml:space="preserve">3,340 則 Markdown 筆記，以 2026 全庫資料生成。重跑 16_gen_vault.py 只覆寫 AUTO 區塊，人工筆記區永不觸碰。</w:t>
       </w:r>
     </w:p>
     <w:tbl>
@@ -11719,8 +11736,7 @@
       <w:tblGrid>
         <w:gridCol w:w="2200"/>
         <w:gridCol w:w="1200"/>
-        <w:gridCol w:w="1400"/>
-        <w:gridCol w:w="4226"/>
+        <w:gridCol w:w="5626"/>
       </w:tblGrid>
       <w:tr>
         <w:trPr>
@@ -11779,13 +11795,13 @@
                 <w:sz w:val="19"/>
                 <w:szCs w:val="19"/>
               </w:rPr>
-              <w:t xml:space="preserve">目前</w:t>
-            </w:r>
-          </w:p>
-        </w:tc>
-        <w:tc>
-          <w:tcPr>
-            <w:tcW w:type="dxa" w:w="1400"/>
+              <w:t xml:space="preserve">筆數</w:t>
+            </w:r>
+          </w:p>
+        </w:tc>
+        <w:tc>
+          <w:tcPr>
+            <w:tcW w:type="dxa" w:w="5626"/>
             <w:shd w:fill="1F3864" w:color="auto" w:val="clear"/>
             <w:tcMar>
               <w:top w:type="dxa" w:w="60"/>
@@ -11797,7 +11813,6 @@
           <w:p>
             <w:pPr>
               <w:spacing w:after="0"/>
-              <w:jc w:val="right"/>
             </w:pPr>
             <w:r>
               <w:rPr>
@@ -11808,34 +11823,6 @@
                 <w:sz w:val="19"/>
                 <w:szCs w:val="19"/>
               </w:rPr>
-              <w:t xml:space="preserve">預計</w:t>
-            </w:r>
-          </w:p>
-        </w:tc>
-        <w:tc>
-          <w:tcPr>
-            <w:tcW w:type="dxa" w:w="4226"/>
-            <w:shd w:fill="1F3864" w:color="auto" w:val="clear"/>
-            <w:tcMar>
-              <w:top w:type="dxa" w:w="60"/>
-              <w:left w:type="dxa" w:w="100"/>
-              <w:bottom w:type="dxa" w:w="60"/>
-              <w:right w:type="dxa" w:w="100"/>
-            </w:tcMar>
-          </w:tcPr>
-          <w:p>
-            <w:pPr>
-              <w:spacing w:after="0"/>
-            </w:pPr>
-            <w:r>
-              <w:rPr>
-                <w:rFonts w:ascii="Microsoft JhengHei" w:cs="Microsoft JhengHei" w:eastAsia="Microsoft JhengHei" w:hAnsi="Microsoft JhengHei"/>
-                <w:b/>
-                <w:bCs/>
-                <w:color w:val="FFFFFF"/>
-                <w:sz w:val="19"/>
-                <w:szCs w:val="19"/>
-              </w:rPr>
               <w:t xml:space="preserve">內容</w:t>
             </w:r>
           </w:p>
@@ -11891,13 +11878,69 @@
                 <w:sz w:val="19"/>
                 <w:szCs w:val="19"/>
               </w:rPr>
-              <w:t xml:space="preserve">0</w:t>
-            </w:r>
-          </w:p>
-        </w:tc>
-        <w:tc>
-          <w:tcPr>
-            <w:tcW w:type="dxa" w:w="1400"/>
+              <w:t xml:space="preserve">2,827</w:t>
+            </w:r>
+          </w:p>
+        </w:tc>
+        <w:tc>
+          <w:tcPr>
+            <w:tcW w:type="dxa" w:w="5626"/>
+            <w:tcMar>
+              <w:top w:type="dxa" w:w="60"/>
+              <w:left w:type="dxa" w:w="100"/>
+              <w:bottom w:type="dxa" w:w="60"/>
+              <w:right w:type="dxa" w:w="100"/>
+            </w:tcMar>
+          </w:tcPr>
+          <w:p>
+            <w:pPr>
+              <w:spacing w:after="0"/>
+            </w:pPr>
+            <w:r>
+              <w:rPr>
+                <w:rFonts w:ascii="Microsoft JhengHei" w:cs="Microsoft JhengHei" w:eastAsia="Microsoft JhengHei" w:hAnsi="Microsoft JhengHei"/>
+                <w:b w:val="false"/>
+                <w:bCs w:val="false"/>
+                <w:sz w:val="19"/>
+                <w:szCs w:val="19"/>
+              </w:rPr>
+              <w:t xml:space="preserve">物種筆記：分類、INCI 名、部位、製程、用途、化合物數、法規</w:t>
+            </w:r>
+          </w:p>
+        </w:tc>
+      </w:tr>
+      <w:tr>
+        <w:tc>
+          <w:tcPr>
+            <w:tcW w:type="dxa" w:w="2200"/>
+            <w:shd w:fill="E8EEF7" w:color="auto" w:val="clear"/>
+            <w:tcMar>
+              <w:top w:type="dxa" w:w="60"/>
+              <w:left w:type="dxa" w:w="100"/>
+              <w:bottom w:type="dxa" w:w="60"/>
+              <w:right w:type="dxa" w:w="100"/>
+            </w:tcMar>
+          </w:tcPr>
+          <w:p>
+            <w:pPr>
+              <w:spacing w:after="0"/>
+            </w:pPr>
+            <w:r>
+              <w:rPr>
+                <w:rFonts w:ascii="Courier New" w:cs="Courier New" w:eastAsia="Courier New" w:hAnsi="Courier New"/>
+                <w:b w:val="false"/>
+                <w:bCs w:val="false"/>
+                <w:sz w:val="19"/>
+                <w:szCs w:val="19"/>
+              </w:rPr>
+              <w:t xml:space="preserve">20-Family/</w:t>
+            </w:r>
+          </w:p>
+        </w:tc>
+        <w:tc>
+          <w:tcPr>
+            <w:tcW w:type="dxa" w:w="1200"/>
+            <w:shd w:fill="E8EEF7" w:color="auto" w:val="clear"/>
             <w:tcMar>
               <w:top w:type="dxa" w:w="60"/>
               <w:left w:type="dxa" w:w="100"/>
@@ -11918,33 +11961,34 @@
                 <w:sz w:val="19"/>
                 <w:szCs w:val="19"/>
               </w:rPr>
-              <w:t xml:space="preserve">約 1,263</w:t>
-            </w:r>
-          </w:p>
-        </w:tc>
-        <w:tc>
-          <w:tcPr>
-            <w:tcW w:type="dxa" w:w="4226"/>
-            <w:tcMar>
-              <w:top w:type="dxa" w:w="60"/>
-              <w:left w:type="dxa" w:w="100"/>
-              <w:bottom w:type="dxa" w:w="60"/>
-              <w:right w:type="dxa" w:w="100"/>
-            </w:tcMar>
-          </w:tcPr>
-          <w:p>
-            <w:pPr>
-              <w:spacing w:after="0"/>
-            </w:pPr>
-            <w:r>
-              <w:rPr>
-                <w:rFonts w:ascii="Microsoft JhengHei" w:cs="Microsoft JhengHei" w:eastAsia="Microsoft JhengHei" w:hAnsi="Microsoft JhengHei"/>
-                <w:b w:val="false"/>
-                <w:bCs w:val="false"/>
-                <w:sz w:val="19"/>
-                <w:szCs w:val="19"/>
-              </w:rPr>
-              <w:t xml:space="preserve">物種筆記，檔名為 GBIF accepted name</w:t>
+              <w:t xml:space="preserve">376</w:t>
+            </w:r>
+          </w:p>
+        </w:tc>
+        <w:tc>
+          <w:tcPr>
+            <w:tcW w:type="dxa" w:w="5626"/>
+            <w:shd w:fill="E8EEF7" w:color="auto" w:val="clear"/>
+            <w:tcMar>
+              <w:top w:type="dxa" w:w="60"/>
+              <w:left w:type="dxa" w:w="100"/>
+              <w:bottom w:type="dxa" w:w="60"/>
+              <w:right w:type="dxa" w:w="100"/>
+            </w:tcMar>
+          </w:tcPr>
+          <w:p>
+            <w:pPr>
+              <w:spacing w:after="0"/>
+            </w:pPr>
+            <w:r>
+              <w:rPr>
+                <w:rFonts w:ascii="Microsoft JhengHei" w:cs="Microsoft JhengHei" w:eastAsia="Microsoft JhengHei" w:hAnsi="Microsoft JhengHei"/>
+                <w:b w:val="false"/>
+                <w:bCs w:val="false"/>
+                <w:sz w:val="19"/>
+                <w:szCs w:val="19"/>
+              </w:rPr>
+              <w:t xml:space="preserve">科筆記：物種清單、用途分布、受限率、化合物概覽</w:t>
             </w:r>
           </w:p>
         </w:tc>
@@ -11953,7 +11997,6 @@
         <w:tc>
           <w:tcPr>
             <w:tcW w:type="dxa" w:w="2200"/>
-            <w:shd w:fill="E8EEF7" w:color="auto" w:val="clear"/>
             <w:tcMar>
               <w:top w:type="dxa" w:w="60"/>
               <w:left w:type="dxa" w:w="100"/>
@@ -11973,14 +12016,13 @@
                 <w:sz w:val="19"/>
                 <w:szCs w:val="19"/>
               </w:rPr>
-              <w:t xml:space="preserve">20-Family/</w:t>
+              <w:t xml:space="preserve">30-MOC/</w:t>
             </w:r>
           </w:p>
         </w:tc>
         <w:tc>
           <w:tcPr>
             <w:tcW w:type="dxa" w:w="1200"/>
-            <w:shd w:fill="E8EEF7" w:color="auto" w:val="clear"/>
             <w:tcMar>
               <w:top w:type="dxa" w:w="60"/>
               <w:left w:type="dxa" w:w="100"/>
@@ -12001,170 +12043,33 @@
                 <w:sz w:val="19"/>
                 <w:szCs w:val="19"/>
               </w:rPr>
-              <w:t xml:space="preserve">0</w:t>
-            </w:r>
-          </w:p>
-        </w:tc>
-        <w:tc>
-          <w:tcPr>
-            <w:tcW w:type="dxa" w:w="1400"/>
-            <w:shd w:fill="E8EEF7" w:color="auto" w:val="clear"/>
-            <w:tcMar>
-              <w:top w:type="dxa" w:w="60"/>
-              <w:left w:type="dxa" w:w="100"/>
-              <w:bottom w:type="dxa" w:w="60"/>
-              <w:right w:type="dxa" w:w="100"/>
-            </w:tcMar>
-          </w:tcPr>
-          <w:p>
-            <w:pPr>
-              <w:spacing w:after="0"/>
-              <w:jc w:val="right"/>
-            </w:pPr>
-            <w:r>
-              <w:rPr>
-                <w:rFonts w:ascii="Microsoft JhengHei" w:cs="Microsoft JhengHei" w:eastAsia="Microsoft JhengHei" w:hAnsi="Microsoft JhengHei"/>
-                <w:b w:val="false"/>
-                <w:bCs w:val="false"/>
-                <w:sz w:val="19"/>
-                <w:szCs w:val="19"/>
-              </w:rPr>
-              <w:t xml:space="preserve">約 189</w:t>
-            </w:r>
-          </w:p>
-        </w:tc>
-        <w:tc>
-          <w:tcPr>
-            <w:tcW w:type="dxa" w:w="4226"/>
-            <w:shd w:fill="E8EEF7" w:color="auto" w:val="clear"/>
-            <w:tcMar>
-              <w:top w:type="dxa" w:w="60"/>
-              <w:left w:type="dxa" w:w="100"/>
-              <w:bottom w:type="dxa" w:w="60"/>
-              <w:right w:type="dxa" w:w="100"/>
-            </w:tcMar>
-          </w:tcPr>
-          <w:p>
-            <w:pPr>
-              <w:spacing w:after="0"/>
-            </w:pPr>
-            <w:r>
-              <w:rPr>
-                <w:rFonts w:ascii="Microsoft JhengHei" w:cs="Microsoft JhengHei" w:eastAsia="Microsoft JhengHei" w:hAnsi="Microsoft JhengHei"/>
-                <w:b w:val="false"/>
-                <w:bCs w:val="false"/>
-                <w:sz w:val="19"/>
-                <w:szCs w:val="19"/>
-              </w:rPr>
-              <w:t xml:space="preserve">科筆記，本專案最有價值的產出</w:t>
-            </w:r>
-          </w:p>
-        </w:tc>
-      </w:tr>
-      <w:tr>
-        <w:tc>
-          <w:tcPr>
-            <w:tcW w:type="dxa" w:w="2200"/>
-            <w:tcMar>
-              <w:top w:type="dxa" w:w="60"/>
-              <w:left w:type="dxa" w:w="100"/>
-              <w:bottom w:type="dxa" w:w="60"/>
-              <w:right w:type="dxa" w:w="100"/>
-            </w:tcMar>
-          </w:tcPr>
-          <w:p>
-            <w:pPr>
-              <w:spacing w:after="0"/>
-            </w:pPr>
-            <w:r>
-              <w:rPr>
-                <w:rFonts w:ascii="Courier New" w:cs="Courier New" w:eastAsia="Courier New" w:hAnsi="Courier New"/>
-                <w:b w:val="false"/>
-                <w:bCs w:val="false"/>
-                <w:sz w:val="19"/>
-                <w:szCs w:val="19"/>
-              </w:rPr>
-              <w:t xml:space="preserve">30-MOC/</w:t>
-            </w:r>
-          </w:p>
-        </w:tc>
-        <w:tc>
-          <w:tcPr>
-            <w:tcW w:type="dxa" w:w="1200"/>
-            <w:tcMar>
-              <w:top w:type="dxa" w:w="60"/>
-              <w:left w:type="dxa" w:w="100"/>
-              <w:bottom w:type="dxa" w:w="60"/>
-              <w:right w:type="dxa" w:w="100"/>
-            </w:tcMar>
-          </w:tcPr>
-          <w:p>
-            <w:pPr>
-              <w:spacing w:after="0"/>
-              <w:jc w:val="right"/>
-            </w:pPr>
-            <w:r>
-              <w:rPr>
-                <w:rFonts w:ascii="Microsoft JhengHei" w:cs="Microsoft JhengHei" w:eastAsia="Microsoft JhengHei" w:hAnsi="Microsoft JhengHei"/>
-                <w:b w:val="false"/>
-                <w:bCs w:val="false"/>
-                <w:sz w:val="19"/>
-                <w:szCs w:val="19"/>
-              </w:rPr>
-              <w:t xml:space="preserve">0</w:t>
-            </w:r>
-          </w:p>
-        </w:tc>
-        <w:tc>
-          <w:tcPr>
-            <w:tcW w:type="dxa" w:w="1400"/>
-            <w:tcMar>
-              <w:top w:type="dxa" w:w="60"/>
-              <w:left w:type="dxa" w:w="100"/>
-              <w:bottom w:type="dxa" w:w="60"/>
-              <w:right w:type="dxa" w:w="100"/>
-            </w:tcMar>
-          </w:tcPr>
-          <w:p>
-            <w:pPr>
-              <w:spacing w:after="0"/>
-              <w:jc w:val="right"/>
-            </w:pPr>
-            <w:r>
-              <w:rPr>
-                <w:rFonts w:ascii="Microsoft JhengHei" w:cs="Microsoft JhengHei" w:eastAsia="Microsoft JhengHei" w:hAnsi="Microsoft JhengHei"/>
-                <w:b w:val="false"/>
-                <w:bCs w:val="false"/>
-                <w:sz w:val="19"/>
-                <w:szCs w:val="19"/>
-              </w:rPr>
-              <w:t xml:space="preserve">約 125</w:t>
-            </w:r>
-          </w:p>
-        </w:tc>
-        <w:tc>
-          <w:tcPr>
-            <w:tcW w:type="dxa" w:w="4226"/>
-            <w:tcMar>
-              <w:top w:type="dxa" w:w="60"/>
-              <w:left w:type="dxa" w:w="100"/>
-              <w:bottom w:type="dxa" w:w="60"/>
-              <w:right w:type="dxa" w:w="100"/>
-            </w:tcMar>
-          </w:tcPr>
-          <w:p>
-            <w:pPr>
-              <w:spacing w:after="0"/>
-            </w:pPr>
-            <w:r>
-              <w:rPr>
-                <w:rFonts w:ascii="Microsoft JhengHei" w:cs="Microsoft JhengHei" w:eastAsia="Microsoft JhengHei" w:hAnsi="Microsoft JhengHei"/>
-                <w:b w:val="false"/>
-                <w:bCs w:val="false"/>
-                <w:sz w:val="19"/>
-                <w:szCs w:val="19"/>
-              </w:rPr>
-              <w:t xml:space="preserve">用途 70 / 部位 30 / 製程 25 的樞紐頁</w:t>
+              <w:t xml:space="preserve">137</w:t>
+            </w:r>
+          </w:p>
+        </w:tc>
+        <w:tc>
+          <w:tcPr>
+            <w:tcW w:type="dxa" w:w="5626"/>
+            <w:tcMar>
+              <w:top w:type="dxa" w:w="60"/>
+              <w:left w:type="dxa" w:w="100"/>
+              <w:bottom w:type="dxa" w:w="60"/>
+              <w:right w:type="dxa" w:w="100"/>
+            </w:tcMar>
+          </w:tcPr>
+          <w:p>
+            <w:pPr>
+              <w:spacing w:after="0"/>
+            </w:pPr>
+            <w:r>
+              <w:rPr>
+                <w:rFonts w:ascii="Microsoft JhengHei" w:cs="Microsoft JhengHei" w:eastAsia="Microsoft JhengHei" w:hAnsi="Microsoft JhengHei"/>
+                <w:b w:val="false"/>
+                <w:bCs w:val="false"/>
+                <w:sz w:val="19"/>
+                <w:szCs w:val="19"/>
+              </w:rPr>
+              <w:t xml:space="preserve">用途 82 + 部位 27 + 製程 25 + 索引頁 3</w:t>
             </w:r>
           </w:p>
         </w:tc>
@@ -12186,7 +12091,7 @@
           <w:sz w:val="20"/>
           <w:szCs w:val="20"/>
         </w:rPr>
-        <w:t xml:space="preserve">機器生成區與人工撰寫區必須以 AUTO-START / AUTO-END 標記分隔，腳本永不觸碰人工區。</w:t>
+        <w:t xml:space="preserve">AUTO-START / AUTO-END 標記已驗證：重跑後人工區塊零變動。所有科筆記中的 wikilink 均指向實際存在的物種筆記（0 斷鏈）。</w:t>
       </w:r>
     </w:p>
     <w:p>
@@ -12867,7 +12772,7 @@
                 <w:sz w:val="19"/>
                 <w:szCs w:val="19"/>
               </w:rPr>
-              <w:t xml:space="preserve">Phase 4：LOTUS（物種→成分）與 PubChem（CAS→結構）富集</w:t>
+              <w:t xml:space="preserve">Phase 7：AI 問答層</w:t>
             </w:r>
           </w:p>
         </w:tc>
@@ -12893,345 +12798,13 @@
                 <w:sz w:val="19"/>
                 <w:szCs w:val="19"/>
               </w:rPr>
-              <w:t xml:space="preserve">species_compounds.csv、cas_structures.csv</w:t>
+              <w:t xml:space="preserve">四層混合檢索工具組</w:t>
             </w:r>
           </w:p>
         </w:tc>
         <w:tc>
           <w:tcPr>
             <w:tcW w:type="dxa" w:w="1400"/>
-            <w:tcMar>
-              <w:top w:type="dxa" w:w="60"/>
-              <w:left w:type="dxa" w:w="100"/>
-              <w:bottom w:type="dxa" w:w="60"/>
-              <w:right w:type="dxa" w:w="100"/>
-            </w:tcMar>
-          </w:tcPr>
-          <w:p>
-            <w:pPr>
-              <w:spacing w:after="0"/>
-              <w:jc w:val="center"/>
-            </w:pPr>
-            <w:r>
-              <w:rPr>
-                <w:rFonts w:ascii="Microsoft JhengHei" w:cs="Microsoft JhengHei" w:eastAsia="Microsoft JhengHei" w:hAnsi="Microsoft JhengHei"/>
-                <w:b w:val="false"/>
-                <w:bCs w:val="false"/>
-                <w:sz w:val="19"/>
-                <w:szCs w:val="19"/>
-              </w:rPr>
-              <w:t xml:space="preserve">1 天</w:t>
-            </w:r>
-          </w:p>
-        </w:tc>
-      </w:tr>
-      <w:tr>
-        <w:tc>
-          <w:tcPr>
-            <w:tcW w:type="dxa" w:w="700"/>
-            <w:shd w:fill="E8EEF7" w:color="auto" w:val="clear"/>
-            <w:tcMar>
-              <w:top w:type="dxa" w:w="60"/>
-              <w:left w:type="dxa" w:w="100"/>
-              <w:bottom w:type="dxa" w:w="60"/>
-              <w:right w:type="dxa" w:w="100"/>
-            </w:tcMar>
-          </w:tcPr>
-          <w:p>
-            <w:pPr>
-              <w:spacing w:after="0"/>
-              <w:jc w:val="center"/>
-            </w:pPr>
-            <w:r>
-              <w:rPr>
-                <w:rFonts w:ascii="Microsoft JhengHei" w:cs="Microsoft JhengHei" w:eastAsia="Microsoft JhengHei" w:hAnsi="Microsoft JhengHei"/>
-                <w:b w:val="false"/>
-                <w:bCs w:val="false"/>
-                <w:sz w:val="19"/>
-                <w:szCs w:val="19"/>
-              </w:rPr>
-              <w:t xml:space="preserve">2</w:t>
-            </w:r>
-          </w:p>
-        </w:tc>
-        <w:tc>
-          <w:tcPr>
-            <w:tcW w:type="dxa" w:w="4400"/>
-            <w:shd w:fill="E8EEF7" w:color="auto" w:val="clear"/>
-            <w:tcMar>
-              <w:top w:type="dxa" w:w="60"/>
-              <w:left w:type="dxa" w:w="100"/>
-              <w:bottom w:type="dxa" w:w="60"/>
-              <w:right w:type="dxa" w:w="100"/>
-            </w:tcMar>
-          </w:tcPr>
-          <w:p>
-            <w:pPr>
-              <w:spacing w:after="0"/>
-            </w:pPr>
-            <w:r>
-              <w:rPr>
-                <w:rFonts w:ascii="Microsoft JhengHei" w:cs="Microsoft JhengHei" w:eastAsia="Microsoft JhengHei" w:hAnsi="Microsoft JhengHei"/>
-                <w:b w:val="false"/>
-                <w:bCs w:val="false"/>
-                <w:sz w:val="19"/>
-                <w:szCs w:val="19"/>
-              </w:rPr>
-              <w:t xml:space="preserve">Phase 5：關聯分析（可與 1 平行）</w:t>
-            </w:r>
-          </w:p>
-        </w:tc>
-        <w:tc>
-          <w:tcPr>
-            <w:tcW w:type="dxa" w:w="2526"/>
-            <w:shd w:fill="E8EEF7" w:color="auto" w:val="clear"/>
-            <w:tcMar>
-              <w:top w:type="dxa" w:w="60"/>
-              <w:left w:type="dxa" w:w="100"/>
-              <w:bottom w:type="dxa" w:w="60"/>
-              <w:right w:type="dxa" w:w="100"/>
-            </w:tcMar>
-          </w:tcPr>
-          <w:p>
-            <w:pPr>
-              <w:spacing w:after="0"/>
-            </w:pPr>
-            <w:r>
-              <w:rPr>
-                <w:rFonts w:ascii="Microsoft JhengHei" w:cs="Microsoft JhengHei" w:eastAsia="Microsoft JhengHei" w:hAnsi="Microsoft JhengHei"/>
-                <w:b w:val="false"/>
-                <w:bCs w:val="false"/>
-                <w:sz w:val="19"/>
-                <w:szCs w:val="19"/>
-              </w:rPr>
-              <w:t xml:space="preserve">90-Reports/ 各項分析</w:t>
-            </w:r>
-          </w:p>
-        </w:tc>
-        <w:tc>
-          <w:tcPr>
-            <w:tcW w:type="dxa" w:w="1400"/>
-            <w:shd w:fill="E8EEF7" w:color="auto" w:val="clear"/>
-            <w:tcMar>
-              <w:top w:type="dxa" w:w="60"/>
-              <w:left w:type="dxa" w:w="100"/>
-              <w:bottom w:type="dxa" w:w="60"/>
-              <w:right w:type="dxa" w:w="100"/>
-            </w:tcMar>
-          </w:tcPr>
-          <w:p>
-            <w:pPr>
-              <w:spacing w:after="0"/>
-              <w:jc w:val="center"/>
-            </w:pPr>
-            <w:r>
-              <w:rPr>
-                <w:rFonts w:ascii="Microsoft JhengHei" w:cs="Microsoft JhengHei" w:eastAsia="Microsoft JhengHei" w:hAnsi="Microsoft JhengHei"/>
-                <w:b w:val="false"/>
-                <w:bCs w:val="false"/>
-                <w:sz w:val="19"/>
-                <w:szCs w:val="19"/>
-              </w:rPr>
-              <w:t xml:space="preserve">1.5–2 天</w:t>
-            </w:r>
-          </w:p>
-        </w:tc>
-      </w:tr>
-      <w:tr>
-        <w:tc>
-          <w:tcPr>
-            <w:tcW w:type="dxa" w:w="700"/>
-            <w:tcMar>
-              <w:top w:type="dxa" w:w="60"/>
-              <w:left w:type="dxa" w:w="100"/>
-              <w:bottom w:type="dxa" w:w="60"/>
-              <w:right w:type="dxa" w:w="100"/>
-            </w:tcMar>
-          </w:tcPr>
-          <w:p>
-            <w:pPr>
-              <w:spacing w:after="0"/>
-              <w:jc w:val="center"/>
-            </w:pPr>
-            <w:r>
-              <w:rPr>
-                <w:rFonts w:ascii="Microsoft JhengHei" w:cs="Microsoft JhengHei" w:eastAsia="Microsoft JhengHei" w:hAnsi="Microsoft JhengHei"/>
-                <w:b w:val="false"/>
-                <w:bCs w:val="false"/>
-                <w:sz w:val="19"/>
-                <w:szCs w:val="19"/>
-              </w:rPr>
-              <w:t xml:space="preserve">3</w:t>
-            </w:r>
-          </w:p>
-        </w:tc>
-        <w:tc>
-          <w:tcPr>
-            <w:tcW w:type="dxa" w:w="4400"/>
-            <w:tcMar>
-              <w:top w:type="dxa" w:w="60"/>
-              <w:left w:type="dxa" w:w="100"/>
-              <w:bottom w:type="dxa" w:w="60"/>
-              <w:right w:type="dxa" w:w="100"/>
-            </w:tcMar>
-          </w:tcPr>
-          <w:p>
-            <w:pPr>
-              <w:spacing w:after="0"/>
-            </w:pPr>
-            <w:r>
-              <w:rPr>
-                <w:rFonts w:ascii="Microsoft JhengHei" w:cs="Microsoft JhengHei" w:eastAsia="Microsoft JhengHei" w:hAnsi="Microsoft JhengHei"/>
-                <w:b w:val="false"/>
-                <w:bCs w:val="false"/>
-                <w:sz w:val="19"/>
-                <w:szCs w:val="19"/>
-              </w:rPr>
-              <w:t xml:space="preserve">Phase 6：Vault 筆記生成</w:t>
-            </w:r>
-          </w:p>
-        </w:tc>
-        <w:tc>
-          <w:tcPr>
-            <w:tcW w:type="dxa" w:w="2526"/>
-            <w:tcMar>
-              <w:top w:type="dxa" w:w="60"/>
-              <w:left w:type="dxa" w:w="100"/>
-              <w:bottom w:type="dxa" w:w="60"/>
-              <w:right w:type="dxa" w:w="100"/>
-            </w:tcMar>
-          </w:tcPr>
-          <w:p>
-            <w:pPr>
-              <w:spacing w:after="0"/>
-            </w:pPr>
-            <w:r>
-              <w:rPr>
-                <w:rFonts w:ascii="Microsoft JhengHei" w:cs="Microsoft JhengHei" w:eastAsia="Microsoft JhengHei" w:hAnsi="Microsoft JhengHei"/>
-                <w:b w:val="false"/>
-                <w:bCs w:val="false"/>
-                <w:sz w:val="19"/>
-                <w:szCs w:val="19"/>
-              </w:rPr>
-              <w:t xml:space="preserve">10-Species / 20-Family / 30-MOC</w:t>
-            </w:r>
-          </w:p>
-        </w:tc>
-        <w:tc>
-          <w:tcPr>
-            <w:tcW w:type="dxa" w:w="1400"/>
-            <w:tcMar>
-              <w:top w:type="dxa" w:w="60"/>
-              <w:left w:type="dxa" w:w="100"/>
-              <w:bottom w:type="dxa" w:w="60"/>
-              <w:right w:type="dxa" w:w="100"/>
-            </w:tcMar>
-          </w:tcPr>
-          <w:p>
-            <w:pPr>
-              <w:spacing w:after="0"/>
-              <w:jc w:val="center"/>
-            </w:pPr>
-            <w:r>
-              <w:rPr>
-                <w:rFonts w:ascii="Microsoft JhengHei" w:cs="Microsoft JhengHei" w:eastAsia="Microsoft JhengHei" w:hAnsi="Microsoft JhengHei"/>
-                <w:b w:val="false"/>
-                <w:bCs w:val="false"/>
-                <w:sz w:val="19"/>
-                <w:szCs w:val="19"/>
-              </w:rPr>
-              <w:t xml:space="preserve">1 天</w:t>
-            </w:r>
-          </w:p>
-        </w:tc>
-      </w:tr>
-      <w:tr>
-        <w:tc>
-          <w:tcPr>
-            <w:tcW w:type="dxa" w:w="700"/>
-            <w:shd w:fill="E8EEF7" w:color="auto" w:val="clear"/>
-            <w:tcMar>
-              <w:top w:type="dxa" w:w="60"/>
-              <w:left w:type="dxa" w:w="100"/>
-              <w:bottom w:type="dxa" w:w="60"/>
-              <w:right w:type="dxa" w:w="100"/>
-            </w:tcMar>
-          </w:tcPr>
-          <w:p>
-            <w:pPr>
-              <w:spacing w:after="0"/>
-              <w:jc w:val="center"/>
-            </w:pPr>
-            <w:r>
-              <w:rPr>
-                <w:rFonts w:ascii="Microsoft JhengHei" w:cs="Microsoft JhengHei" w:eastAsia="Microsoft JhengHei" w:hAnsi="Microsoft JhengHei"/>
-                <w:b w:val="false"/>
-                <w:bCs w:val="false"/>
-                <w:sz w:val="19"/>
-                <w:szCs w:val="19"/>
-              </w:rPr>
-              <w:t xml:space="preserve">4</w:t>
-            </w:r>
-          </w:p>
-        </w:tc>
-        <w:tc>
-          <w:tcPr>
-            <w:tcW w:type="dxa" w:w="4400"/>
-            <w:shd w:fill="E8EEF7" w:color="auto" w:val="clear"/>
-            <w:tcMar>
-              <w:top w:type="dxa" w:w="60"/>
-              <w:left w:type="dxa" w:w="100"/>
-              <w:bottom w:type="dxa" w:w="60"/>
-              <w:right w:type="dxa" w:w="100"/>
-            </w:tcMar>
-          </w:tcPr>
-          <w:p>
-            <w:pPr>
-              <w:spacing w:after="0"/>
-            </w:pPr>
-            <w:r>
-              <w:rPr>
-                <w:rFonts w:ascii="Microsoft JhengHei" w:cs="Microsoft JhengHei" w:eastAsia="Microsoft JhengHei" w:hAnsi="Microsoft JhengHei"/>
-                <w:b w:val="false"/>
-                <w:bCs w:val="false"/>
-                <w:sz w:val="19"/>
-                <w:szCs w:val="19"/>
-              </w:rPr>
-              <w:t xml:space="preserve">Phase 7：AI 問答層</w:t>
-            </w:r>
-          </w:p>
-        </w:tc>
-        <w:tc>
-          <w:tcPr>
-            <w:tcW w:type="dxa" w:w="2526"/>
-            <w:shd w:fill="E8EEF7" w:color="auto" w:val="clear"/>
-            <w:tcMar>
-              <w:top w:type="dxa" w:w="60"/>
-              <w:left w:type="dxa" w:w="100"/>
-              <w:bottom w:type="dxa" w:w="60"/>
-              <w:right w:type="dxa" w:w="100"/>
-            </w:tcMar>
-          </w:tcPr>
-          <w:p>
-            <w:pPr>
-              <w:spacing w:after="0"/>
-            </w:pPr>
-            <w:r>
-              <w:rPr>
-                <w:rFonts w:ascii="Microsoft JhengHei" w:cs="Microsoft JhengHei" w:eastAsia="Microsoft JhengHei" w:hAnsi="Microsoft JhengHei"/>
-                <w:b w:val="false"/>
-                <w:bCs w:val="false"/>
-                <w:sz w:val="19"/>
-                <w:szCs w:val="19"/>
-              </w:rPr>
-              <w:t xml:space="preserve">四層混合檢索工具組</w:t>
-            </w:r>
-          </w:p>
-        </w:tc>
-        <w:tc>
-          <w:tcPr>
-            <w:tcW w:type="dxa" w:w="1400"/>
-            <w:shd w:fill="E8EEF7" w:color="auto" w:val="clear"/>
             <w:tcMar>
               <w:top w:type="dxa" w:w="60"/>
               <w:left w:type="dxa" w:w="100"/>
@@ -16559,6 +16132,116 @@
                 <w:sz w:val="19"/>
                 <w:szCs w:val="19"/>
               </w:rPr>
+              <w:t xml:space="preserve">_scripts/15_associations.py</w:t>
+            </w:r>
+          </w:p>
+        </w:tc>
+        <w:tc>
+          <w:tcPr>
+            <w:tcW w:type="dxa" w:w="5626"/>
+            <w:shd w:fill="E8EEF7" w:color="auto" w:val="clear"/>
+            <w:tcMar>
+              <w:top w:type="dxa" w:w="60"/>
+              <w:left w:type="dxa" w:w="100"/>
+              <w:bottom w:type="dxa" w:w="60"/>
+              <w:right w:type="dxa" w:w="100"/>
+            </w:tcMar>
+          </w:tcPr>
+          <w:p>
+            <w:pPr>
+              <w:spacing w:after="0"/>
+            </w:pPr>
+            <w:r>
+              <w:rPr>
+                <w:rFonts w:ascii="Microsoft JhengHei" w:cs="Microsoft JhengHei" w:eastAsia="Microsoft JhengHei" w:hAnsi="Microsoft JhengHei"/>
+                <w:b w:val="false"/>
+                <w:bCs w:val="false"/>
+                <w:sz w:val="19"/>
+                <w:szCs w:val="19"/>
+              </w:rPr>
+              <w:t xml:space="preserve">Phase 5 六項跨面向關聯分析</w:t>
+            </w:r>
+          </w:p>
+        </w:tc>
+      </w:tr>
+      <w:tr>
+        <w:tc>
+          <w:tcPr>
+            <w:tcW w:type="dxa" w:w="3400"/>
+            <w:tcMar>
+              <w:top w:type="dxa" w:w="60"/>
+              <w:left w:type="dxa" w:w="100"/>
+              <w:bottom w:type="dxa" w:w="60"/>
+              <w:right w:type="dxa" w:w="100"/>
+            </w:tcMar>
+          </w:tcPr>
+          <w:p>
+            <w:pPr>
+              <w:spacing w:after="0"/>
+            </w:pPr>
+            <w:r>
+              <w:rPr>
+                <w:rFonts w:ascii="Courier New" w:cs="Courier New" w:eastAsia="Courier New" w:hAnsi="Courier New"/>
+                <w:b w:val="false"/>
+                <w:bCs w:val="false"/>
+                <w:sz w:val="19"/>
+                <w:szCs w:val="19"/>
+              </w:rPr>
+              <w:t xml:space="preserve">_scripts/16_gen_vault.py</w:t>
+            </w:r>
+          </w:p>
+        </w:tc>
+        <w:tc>
+          <w:tcPr>
+            <w:tcW w:type="dxa" w:w="5626"/>
+            <w:tcMar>
+              <w:top w:type="dxa" w:w="60"/>
+              <w:left w:type="dxa" w:w="100"/>
+              <w:bottom w:type="dxa" w:w="60"/>
+              <w:right w:type="dxa" w:w="100"/>
+            </w:tcMar>
+          </w:tcPr>
+          <w:p>
+            <w:pPr>
+              <w:spacing w:after="0"/>
+            </w:pPr>
+            <w:r>
+              <w:rPr>
+                <w:rFonts w:ascii="Microsoft JhengHei" w:cs="Microsoft JhengHei" w:eastAsia="Microsoft JhengHei" w:hAnsi="Microsoft JhengHei"/>
+                <w:b w:val="false"/>
+                <w:bCs w:val="false"/>
+                <w:sz w:val="19"/>
+                <w:szCs w:val="19"/>
+              </w:rPr>
+              <w:t xml:space="preserve">Phase 6 Vault 筆記生成（3,340 則）</w:t>
+            </w:r>
+          </w:p>
+        </w:tc>
+      </w:tr>
+      <w:tr>
+        <w:tc>
+          <w:tcPr>
+            <w:tcW w:type="dxa" w:w="3400"/>
+            <w:shd w:fill="E8EEF7" w:color="auto" w:val="clear"/>
+            <w:tcMar>
+              <w:top w:type="dxa" w:w="60"/>
+              <w:left w:type="dxa" w:w="100"/>
+              <w:bottom w:type="dxa" w:w="60"/>
+              <w:right w:type="dxa" w:w="100"/>
+            </w:tcMar>
+          </w:tcPr>
+          <w:p>
+            <w:pPr>
+              <w:spacing w:after="0"/>
+            </w:pPr>
+            <w:r>
+              <w:rPr>
+                <w:rFonts w:ascii="Courier New" w:cs="Courier New" w:eastAsia="Courier New" w:hAnsi="Courier New"/>
+                <w:b w:val="false"/>
+                <w:bCs w:val="false"/>
+                <w:sz w:val="19"/>
+                <w:szCs w:val="19"/>
+              </w:rPr>
               <w:t xml:space="preserve">_scripts/07_insights.py</w:t>
             </w:r>
           </w:p>
@@ -17137,6 +16820,226 @@
                 <w:szCs w:val="19"/>
               </w:rPr>
               <w:t xml:space="preserve">Phase 4b PubChem 結構覆蓋率</w:t>
+            </w:r>
+          </w:p>
+        </w:tc>
+      </w:tr>
+      <w:tr>
+        <w:tc>
+          <w:tcPr>
+            <w:tcW w:type="dxa" w:w="3400"/>
+            <w:tcMar>
+              <w:top w:type="dxa" w:w="60"/>
+              <w:left w:type="dxa" w:w="100"/>
+              <w:bottom w:type="dxa" w:w="60"/>
+              <w:right w:type="dxa" w:w="100"/>
+            </w:tcMar>
+          </w:tcPr>
+          <w:p>
+            <w:pPr>
+              <w:spacing w:after="0"/>
+            </w:pPr>
+            <w:r>
+              <w:rPr>
+                <w:rFonts w:ascii="Courier New" w:cs="Courier New" w:eastAsia="Courier New" w:hAnsi="Courier New"/>
+                <w:b w:val="false"/>
+                <w:bCs w:val="false"/>
+                <w:sz w:val="19"/>
+                <w:szCs w:val="19"/>
+              </w:rPr>
+              <w:t xml:space="preserve">90-Reports/associations_v2026.md</w:t>
+            </w:r>
+          </w:p>
+        </w:tc>
+        <w:tc>
+          <w:tcPr>
+            <w:tcW w:type="dxa" w:w="5626"/>
+            <w:tcMar>
+              <w:top w:type="dxa" w:w="60"/>
+              <w:left w:type="dxa" w:w="100"/>
+              <w:bottom w:type="dxa" w:w="60"/>
+              <w:right w:type="dxa" w:w="100"/>
+            </w:tcMar>
+          </w:tcPr>
+          <w:p>
+            <w:pPr>
+              <w:spacing w:after="0"/>
+            </w:pPr>
+            <w:r>
+              <w:rPr>
+                <w:rFonts w:ascii="Microsoft JhengHei" w:cs="Microsoft JhengHei" w:eastAsia="Microsoft JhengHei" w:hAnsi="Microsoft JhengHei"/>
+                <w:b w:val="false"/>
+                <w:bCs w:val="false"/>
+                <w:sz w:val="19"/>
+                <w:szCs w:val="19"/>
+              </w:rPr>
+              <w:t xml:space="preserve">Phase 5 關聯分析（780 行，六項分析 + 驗收）</w:t>
+            </w:r>
+          </w:p>
+        </w:tc>
+      </w:tr>
+      <w:tr>
+        <w:tc>
+          <w:tcPr>
+            <w:tcW w:type="dxa" w:w="3400"/>
+            <w:shd w:fill="E8EEF7" w:color="auto" w:val="clear"/>
+            <w:tcMar>
+              <w:top w:type="dxa" w:w="60"/>
+              <w:left w:type="dxa" w:w="100"/>
+              <w:bottom w:type="dxa" w:w="60"/>
+              <w:right w:type="dxa" w:w="100"/>
+            </w:tcMar>
+          </w:tcPr>
+          <w:p>
+            <w:pPr>
+              <w:spacing w:after="0"/>
+            </w:pPr>
+            <w:r>
+              <w:rPr>
+                <w:rFonts w:ascii="Courier New" w:cs="Courier New" w:eastAsia="Courier New" w:hAnsi="Courier New"/>
+                <w:b w:val="false"/>
+                <w:bCs w:val="false"/>
+                <w:sz w:val="19"/>
+                <w:szCs w:val="19"/>
+              </w:rPr>
+              <w:t xml:space="preserve">10-Species/</w:t>
+            </w:r>
+          </w:p>
+        </w:tc>
+        <w:tc>
+          <w:tcPr>
+            <w:tcW w:type="dxa" w:w="5626"/>
+            <w:shd w:fill="E8EEF7" w:color="auto" w:val="clear"/>
+            <w:tcMar>
+              <w:top w:type="dxa" w:w="60"/>
+              <w:left w:type="dxa" w:w="100"/>
+              <w:bottom w:type="dxa" w:w="60"/>
+              <w:right w:type="dxa" w:w="100"/>
+            </w:tcMar>
+          </w:tcPr>
+          <w:p>
+            <w:pPr>
+              <w:spacing w:after="0"/>
+            </w:pPr>
+            <w:r>
+              <w:rPr>
+                <w:rFonts w:ascii="Microsoft JhengHei" w:cs="Microsoft JhengHei" w:eastAsia="Microsoft JhengHei" w:hAnsi="Microsoft JhengHei"/>
+                <w:b w:val="false"/>
+                <w:bCs w:val="false"/>
+                <w:sz w:val="19"/>
+                <w:szCs w:val="19"/>
+              </w:rPr>
+              <w:t xml:space="preserve">Phase 6 物種筆記（2,827 則）</w:t>
+            </w:r>
+          </w:p>
+        </w:tc>
+      </w:tr>
+      <w:tr>
+        <w:tc>
+          <w:tcPr>
+            <w:tcW w:type="dxa" w:w="3400"/>
+            <w:tcMar>
+              <w:top w:type="dxa" w:w="60"/>
+              <w:left w:type="dxa" w:w="100"/>
+              <w:bottom w:type="dxa" w:w="60"/>
+              <w:right w:type="dxa" w:w="100"/>
+            </w:tcMar>
+          </w:tcPr>
+          <w:p>
+            <w:pPr>
+              <w:spacing w:after="0"/>
+            </w:pPr>
+            <w:r>
+              <w:rPr>
+                <w:rFonts w:ascii="Courier New" w:cs="Courier New" w:eastAsia="Courier New" w:hAnsi="Courier New"/>
+                <w:b w:val="false"/>
+                <w:bCs w:val="false"/>
+                <w:sz w:val="19"/>
+                <w:szCs w:val="19"/>
+              </w:rPr>
+              <w:t xml:space="preserve">20-Family/</w:t>
+            </w:r>
+          </w:p>
+        </w:tc>
+        <w:tc>
+          <w:tcPr>
+            <w:tcW w:type="dxa" w:w="5626"/>
+            <w:tcMar>
+              <w:top w:type="dxa" w:w="60"/>
+              <w:left w:type="dxa" w:w="100"/>
+              <w:bottom w:type="dxa" w:w="60"/>
+              <w:right w:type="dxa" w:w="100"/>
+            </w:tcMar>
+          </w:tcPr>
+          <w:p>
+            <w:pPr>
+              <w:spacing w:after="0"/>
+            </w:pPr>
+            <w:r>
+              <w:rPr>
+                <w:rFonts w:ascii="Microsoft JhengHei" w:cs="Microsoft JhengHei" w:eastAsia="Microsoft JhengHei" w:hAnsi="Microsoft JhengHei"/>
+                <w:b w:val="false"/>
+                <w:bCs w:val="false"/>
+                <w:sz w:val="19"/>
+                <w:szCs w:val="19"/>
+              </w:rPr>
+              <w:t xml:space="preserve">Phase 6 科筆記（376 則）</w:t>
+            </w:r>
+          </w:p>
+        </w:tc>
+      </w:tr>
+      <w:tr>
+        <w:tc>
+          <w:tcPr>
+            <w:tcW w:type="dxa" w:w="3400"/>
+            <w:shd w:fill="E8EEF7" w:color="auto" w:val="clear"/>
+            <w:tcMar>
+              <w:top w:type="dxa" w:w="60"/>
+              <w:left w:type="dxa" w:w="100"/>
+              <w:bottom w:type="dxa" w:w="60"/>
+              <w:right w:type="dxa" w:w="100"/>
+            </w:tcMar>
+          </w:tcPr>
+          <w:p>
+            <w:pPr>
+              <w:spacing w:after="0"/>
+            </w:pPr>
+            <w:r>
+              <w:rPr>
+                <w:rFonts w:ascii="Courier New" w:cs="Courier New" w:eastAsia="Courier New" w:hAnsi="Courier New"/>
+                <w:b w:val="false"/>
+                <w:bCs w:val="false"/>
+                <w:sz w:val="19"/>
+                <w:szCs w:val="19"/>
+              </w:rPr>
+              <w:t xml:space="preserve">30-MOC/</w:t>
+            </w:r>
+          </w:p>
+        </w:tc>
+        <w:tc>
+          <w:tcPr>
+            <w:tcW w:type="dxa" w:w="5626"/>
+            <w:shd w:fill="E8EEF7" w:color="auto" w:val="clear"/>
+            <w:tcMar>
+              <w:top w:type="dxa" w:w="60"/>
+              <w:left w:type="dxa" w:w="100"/>
+              <w:bottom w:type="dxa" w:w="60"/>
+              <w:right w:type="dxa" w:w="100"/>
+            </w:tcMar>
+          </w:tcPr>
+          <w:p>
+            <w:pPr>
+              <w:spacing w:after="0"/>
+            </w:pPr>
+            <w:r>
+              <w:rPr>
+                <w:rFonts w:ascii="Microsoft JhengHei" w:cs="Microsoft JhengHei" w:eastAsia="Microsoft JhengHei" w:hAnsi="Microsoft JhengHei"/>
+                <w:b w:val="false"/>
+                <w:bCs w:val="false"/>
+                <w:sz w:val="19"/>
+                <w:szCs w:val="19"/>
+              </w:rPr>
+              <w:t xml:space="preserve">Phase 6 用途/部位/製程 MOC（137 則）</w:t>
             </w:r>
           </w:p>
         </w:tc>

</xml_diff>